<commit_message>
Update to second revision at AER and update presentations in CV (new UIB date + NHH brown bag)
</commit_message>
<xml_diff>
--- a/files/CV_Adam_Reiremo.docx
+++ b/files/CV_Adam_Reiremo.docx
@@ -1093,6 +1093,15 @@
               </w:rPr>
               <w:t>, revise &amp; resubmit</w:t>
             </w:r>
+            <w:r>
+              <w:rPr>
+                <w:rFonts w:ascii="Palatino Linotype" w:hAnsi="Palatino Linotype"/>
+                <w:i/>
+                <w:iCs/>
+                <w:lang w:val="en-US"/>
+              </w:rPr>
+              <w:t xml:space="preserve"> (second round)</w:t>
+            </w:r>
           </w:p>
           <w:p>
             <w:pPr>
@@ -2874,58 +2883,21 @@
                 <w:rFonts w:ascii="Palatino Linotype" w:hAnsi="Palatino Linotype"/>
                 <w:lang w:val="en-US"/>
               </w:rPr>
-              <w:t>Workshop on Human Capital and Education</w:t>
-            </w:r>
-            <w:r>
-              <w:rPr>
-                <w:rFonts w:ascii="Palatino Linotype" w:hAnsi="Palatino Linotype"/>
-                <w:lang w:val="en-US"/>
-              </w:rPr>
-              <w:t xml:space="preserve"> organized by </w:t>
-            </w:r>
-            <w:r>
-              <w:rPr>
-                <w:rFonts w:ascii="Palatino Linotype" w:hAnsi="Palatino Linotype"/>
-                <w:lang w:val="en-US"/>
-              </w:rPr>
-              <w:t>Max Planck Institute for Behavioral Economics</w:t>
-            </w:r>
-            <w:r>
-              <w:rPr>
-                <w:rFonts w:ascii="Palatino Linotype" w:hAnsi="Palatino Linotype"/>
-                <w:lang w:val="en-US"/>
-              </w:rPr>
-              <w:t xml:space="preserve"> and </w:t>
-            </w:r>
-            <w:proofErr w:type="spellStart"/>
-            <w:r>
-              <w:rPr>
-                <w:rFonts w:ascii="Palatino Linotype" w:hAnsi="Palatino Linotype"/>
-                <w:lang w:val="en-US"/>
-              </w:rPr>
-              <w:t>ECONtribute</w:t>
-            </w:r>
-            <w:proofErr w:type="spellEnd"/>
-            <w:r>
-              <w:rPr>
-                <w:rFonts w:ascii="Palatino Linotype" w:hAnsi="Palatino Linotype"/>
-                <w:lang w:val="en-US"/>
-              </w:rPr>
-              <w:t xml:space="preserve"> in Bonn (October 1</w:t>
-            </w:r>
-            <w:r>
-              <w:rPr>
-                <w:rFonts w:ascii="Palatino Linotype" w:hAnsi="Palatino Linotype"/>
-                <w:lang w:val="en-US"/>
-              </w:rPr>
-              <w:t xml:space="preserve"> &amp; </w:t>
-            </w:r>
-            <w:r>
-              <w:rPr>
-                <w:rFonts w:ascii="Palatino Linotype" w:hAnsi="Palatino Linotype"/>
-                <w:lang w:val="en-US"/>
-              </w:rPr>
-              <w:t>2)</w:t>
+              <w:t>Norwegian School of Economics, Department of Economics brown bag seminar (</w:t>
+            </w:r>
+            <w:r>
+              <w:rPr>
+                <w:rFonts w:ascii="Palatino Linotype" w:hAnsi="Palatino Linotype"/>
+                <w:lang w:val="en-US"/>
+              </w:rPr>
+              <w:t xml:space="preserve">October </w:t>
+            </w:r>
+            <w:r>
+              <w:rPr>
+                <w:rFonts w:ascii="Palatino Linotype" w:hAnsi="Palatino Linotype"/>
+                <w:lang w:val="en-US"/>
+              </w:rPr>
+              <w:t>25)</w:t>
             </w:r>
           </w:p>
           <w:p>
@@ -2945,35 +2917,35 @@
                 <w:rFonts w:ascii="Palatino Linotype" w:hAnsi="Palatino Linotype"/>
                 <w:lang w:val="en-US"/>
               </w:rPr>
-              <w:t>University of Bergen, department seminar (Sept</w:t>
-            </w:r>
-            <w:r>
-              <w:rPr>
-                <w:rFonts w:ascii="Palatino Linotype" w:hAnsi="Palatino Linotype"/>
-                <w:lang w:val="en-US"/>
-              </w:rPr>
-              <w:t>ember 2</w:t>
-            </w:r>
-            <w:r>
-              <w:rPr>
-                <w:rFonts w:ascii="Palatino Linotype" w:hAnsi="Palatino Linotype"/>
-                <w:lang w:val="en-US"/>
-              </w:rPr>
-              <w:t>5</w:t>
-            </w:r>
-            <w:r>
-              <w:rPr>
-                <w:rFonts w:ascii="Palatino Linotype" w:hAnsi="Palatino Linotype"/>
-                <w:lang w:val="en-US"/>
-              </w:rPr>
-              <w:t>,</w:t>
-            </w:r>
-            <w:r>
-              <w:rPr>
-                <w:rFonts w:ascii="Palatino Linotype" w:hAnsi="Palatino Linotype"/>
-                <w:lang w:val="en-US"/>
-              </w:rPr>
-              <w:t xml:space="preserve"> by invitation)</w:t>
+              <w:t>University of Bergen, department seminar (</w:t>
+            </w:r>
+            <w:r>
+              <w:rPr>
+                <w:rFonts w:ascii="Palatino Linotype" w:hAnsi="Palatino Linotype"/>
+                <w:lang w:val="en-US"/>
+              </w:rPr>
+              <w:t xml:space="preserve">October </w:t>
+            </w:r>
+            <w:r>
+              <w:rPr>
+                <w:rFonts w:ascii="Palatino Linotype" w:hAnsi="Palatino Linotype"/>
+                <w:lang w:val="en-US"/>
+              </w:rPr>
+              <w:t>2</w:t>
+            </w:r>
+            <w:r>
+              <w:rPr>
+                <w:rFonts w:ascii="Palatino Linotype" w:hAnsi="Palatino Linotype"/>
+                <w:lang w:val="en-US"/>
+              </w:rPr>
+              <w:t>3</w:t>
+            </w:r>
+            <w:r>
+              <w:rPr>
+                <w:rFonts w:ascii="Palatino Linotype" w:hAnsi="Palatino Linotype"/>
+                <w:lang w:val="en-US"/>
+              </w:rPr>
+              <w:t>, by invitation)</w:t>
             </w:r>
           </w:p>
           <w:p>
@@ -2993,44 +2965,60 @@
                 <w:rFonts w:ascii="Palatino Linotype" w:hAnsi="Palatino Linotype"/>
                 <w:lang w:val="en-US"/>
               </w:rPr>
-              <w:t>Norwegian School of Economics / FAIR (brown bag seminar</w:t>
-            </w:r>
-            <w:r>
-              <w:rPr>
-                <w:rFonts w:ascii="Palatino Linotype" w:hAnsi="Palatino Linotype"/>
-                <w:lang w:val="en-US"/>
-              </w:rPr>
-              <w:t>)</w:t>
-            </w:r>
-          </w:p>
-        </w:tc>
-      </w:tr>
-      <w:tr>
-        <w:tc>
-          <w:tcPr>
-            <w:tcW w:w="851" w:type="dxa"/>
-          </w:tcPr>
-          <w:p>
-            <w:pPr>
-              <w:jc w:val="right"/>
-              <w:rPr>
-                <w:rFonts w:ascii="Palatino Linotype" w:hAnsi="Palatino Linotype"/>
-                <w:lang w:val="en-US"/>
-              </w:rPr>
-            </w:pPr>
-            <w:r>
-              <w:rPr>
-                <w:rFonts w:ascii="Palatino Linotype" w:hAnsi="Palatino Linotype"/>
-                <w:lang w:val="en-US"/>
-              </w:rPr>
-              <w:t>2025</w:t>
-            </w:r>
-          </w:p>
-        </w:tc>
-        <w:tc>
-          <w:tcPr>
-            <w:tcW w:w="8165" w:type="dxa"/>
-          </w:tcPr>
+              <w:t>Workshop on Human Capital and Education</w:t>
+            </w:r>
+            <w:r>
+              <w:rPr>
+                <w:rFonts w:ascii="Palatino Linotype" w:hAnsi="Palatino Linotype"/>
+                <w:lang w:val="en-US"/>
+              </w:rPr>
+              <w:t xml:space="preserve"> organized by </w:t>
+            </w:r>
+            <w:r>
+              <w:rPr>
+                <w:rFonts w:ascii="Palatino Linotype" w:hAnsi="Palatino Linotype"/>
+                <w:lang w:val="en-US"/>
+              </w:rPr>
+              <w:t>Max Planck Institute for Behavioral Economics</w:t>
+            </w:r>
+            <w:r>
+              <w:rPr>
+                <w:rFonts w:ascii="Palatino Linotype" w:hAnsi="Palatino Linotype"/>
+                <w:lang w:val="en-US"/>
+              </w:rPr>
+              <w:t xml:space="preserve"> and </w:t>
+            </w:r>
+            <w:proofErr w:type="spellStart"/>
+            <w:r>
+              <w:rPr>
+                <w:rFonts w:ascii="Palatino Linotype" w:hAnsi="Palatino Linotype"/>
+                <w:lang w:val="en-US"/>
+              </w:rPr>
+              <w:t>ECONtribute</w:t>
+            </w:r>
+            <w:proofErr w:type="spellEnd"/>
+            <w:r>
+              <w:rPr>
+                <w:rFonts w:ascii="Palatino Linotype" w:hAnsi="Palatino Linotype"/>
+                <w:lang w:val="en-US"/>
+              </w:rPr>
+              <w:t xml:space="preserve"> in Bonn (October 1</w:t>
+            </w:r>
+            <w:r>
+              <w:rPr>
+                <w:rFonts w:ascii="Palatino Linotype" w:hAnsi="Palatino Linotype"/>
+                <w:lang w:val="en-US"/>
+              </w:rPr>
+              <w:t xml:space="preserve"> &amp; </w:t>
+            </w:r>
+            <w:r>
+              <w:rPr>
+                <w:rFonts w:ascii="Palatino Linotype" w:hAnsi="Palatino Linotype"/>
+                <w:lang w:val="en-US"/>
+              </w:rPr>
+              <w:t>2)</w:t>
+            </w:r>
+          </w:p>
           <w:p>
             <w:pPr>
               <w:pStyle w:val="ListParagraph"/>
@@ -3048,14 +3036,7 @@
                 <w:rFonts w:ascii="Palatino Linotype" w:hAnsi="Palatino Linotype"/>
                 <w:lang w:val="en-US"/>
               </w:rPr>
-              <w:t>NBER Summer Institute; Children and Families</w:t>
-            </w:r>
-            <w:r>
-              <w:rPr>
-                <w:rFonts w:ascii="Palatino Linotype" w:hAnsi="Palatino Linotype"/>
-                <w:lang w:val="en-US"/>
-              </w:rPr>
-              <w:t xml:space="preserve"> (presented by Jason Cook)</w:t>
+              <w:t>Norwegian School of Economics, Department of Economics brown bag seminar (September 25)</w:t>
             </w:r>
           </w:p>
           <w:p>
@@ -3075,9 +3056,44 @@
                 <w:rFonts w:ascii="Palatino Linotype" w:hAnsi="Palatino Linotype"/>
                 <w:lang w:val="en-US"/>
               </w:rPr>
-              <w:t>Norwegian School of Economics / FAIR (brown bag seminar)</w:t>
-            </w:r>
-          </w:p>
+              <w:t>Norwegian School of Economics / FAIR (brown bag seminar</w:t>
+            </w:r>
+            <w:r>
+              <w:rPr>
+                <w:rFonts w:ascii="Palatino Linotype" w:hAnsi="Palatino Linotype"/>
+                <w:lang w:val="en-US"/>
+              </w:rPr>
+              <w:t>)</w:t>
+            </w:r>
+          </w:p>
+        </w:tc>
+      </w:tr>
+      <w:tr>
+        <w:tc>
+          <w:tcPr>
+            <w:tcW w:w="851" w:type="dxa"/>
+          </w:tcPr>
+          <w:p>
+            <w:pPr>
+              <w:jc w:val="right"/>
+              <w:rPr>
+                <w:rFonts w:ascii="Palatino Linotype" w:hAnsi="Palatino Linotype"/>
+                <w:lang w:val="en-US"/>
+              </w:rPr>
+            </w:pPr>
+            <w:r>
+              <w:rPr>
+                <w:rFonts w:ascii="Palatino Linotype" w:hAnsi="Palatino Linotype"/>
+                <w:lang w:val="en-US"/>
+              </w:rPr>
+              <w:t>2025</w:t>
+            </w:r>
+          </w:p>
+        </w:tc>
+        <w:tc>
+          <w:tcPr>
+            <w:tcW w:w="8165" w:type="dxa"/>
+          </w:tcPr>
           <w:p>
             <w:pPr>
               <w:pStyle w:val="ListParagraph"/>
@@ -3095,44 +3111,16 @@
                 <w:rFonts w:ascii="Palatino Linotype" w:hAnsi="Palatino Linotype"/>
                 <w:lang w:val="en-US"/>
               </w:rPr>
-              <w:t>Nordic Institute for Studies in Innovation, Research and Education</w:t>
-            </w:r>
-            <w:r>
-              <w:rPr>
-                <w:rFonts w:ascii="Palatino Linotype" w:hAnsi="Palatino Linotype"/>
-                <w:lang w:val="en-US"/>
-              </w:rPr>
-              <w:t xml:space="preserve">/NIFU (by invitation) </w:t>
-            </w:r>
-          </w:p>
-        </w:tc>
-      </w:tr>
-      <w:tr>
-        <w:tc>
-          <w:tcPr>
-            <w:tcW w:w="851" w:type="dxa"/>
-          </w:tcPr>
-          <w:p>
-            <w:pPr>
-              <w:jc w:val="right"/>
-              <w:rPr>
-                <w:rFonts w:ascii="Palatino Linotype" w:hAnsi="Palatino Linotype"/>
-                <w:lang w:val="en-US"/>
-              </w:rPr>
-            </w:pPr>
-            <w:r>
-              <w:rPr>
-                <w:rFonts w:ascii="Palatino Linotype" w:hAnsi="Palatino Linotype"/>
-                <w:lang w:val="en-US"/>
-              </w:rPr>
-              <w:t>2024</w:t>
-            </w:r>
-          </w:p>
-        </w:tc>
-        <w:tc>
-          <w:tcPr>
-            <w:tcW w:w="8165" w:type="dxa"/>
-          </w:tcPr>
+              <w:t>NBER Summer Institute; Children and Families</w:t>
+            </w:r>
+            <w:r>
+              <w:rPr>
+                <w:rFonts w:ascii="Palatino Linotype" w:hAnsi="Palatino Linotype"/>
+                <w:lang w:val="en-US"/>
+              </w:rPr>
+              <w:t xml:space="preserve"> (presented by Jason Cook)</w:t>
+            </w:r>
+          </w:p>
           <w:p>
             <w:pPr>
               <w:pStyle w:val="ListParagraph"/>
@@ -3150,35 +3138,7 @@
                 <w:rFonts w:ascii="Palatino Linotype" w:hAnsi="Palatino Linotype"/>
                 <w:lang w:val="en-US"/>
               </w:rPr>
-              <w:t>Bank of Italy; Nontraditional Data, Machine Learning, and Natura</w:t>
-            </w:r>
-            <w:r>
-              <w:rPr>
-                <w:rFonts w:ascii="Palatino Linotype" w:hAnsi="Palatino Linotype"/>
-                <w:lang w:val="en-US"/>
-              </w:rPr>
-              <w:t>l</w:t>
-            </w:r>
-            <w:r>
-              <w:rPr>
-                <w:rFonts w:ascii="Palatino Linotype" w:hAnsi="Palatino Linotype"/>
-                <w:lang w:val="en-US"/>
-              </w:rPr>
-              <w:t xml:space="preserve"> </w:t>
-            </w:r>
-            <w:r>
-              <w:rPr>
-                <w:rFonts w:ascii="Palatino Linotype" w:hAnsi="Palatino Linotype"/>
-                <w:lang w:val="en-US"/>
-              </w:rPr>
-              <w:t>Language Processing for Macroeconomics</w:t>
-            </w:r>
-            <w:r>
-              <w:rPr>
-                <w:rFonts w:ascii="Palatino Linotype" w:hAnsi="Palatino Linotype"/>
-                <w:lang w:val="en-US"/>
-              </w:rPr>
-              <w:t xml:space="preserve"> </w:t>
+              <w:t>Norwegian School of Economics / FAIR (brown bag seminar)</w:t>
             </w:r>
           </w:p>
           <w:p>
@@ -3198,9 +3158,44 @@
                 <w:rFonts w:ascii="Palatino Linotype" w:hAnsi="Palatino Linotype"/>
                 <w:lang w:val="en-US"/>
               </w:rPr>
-              <w:t>Norwegian School of Economics / FAIR (brown bag seminar)</w:t>
-            </w:r>
-          </w:p>
+              <w:t>Nordic Institute for Studies in Innovation, Research and Education</w:t>
+            </w:r>
+            <w:r>
+              <w:rPr>
+                <w:rFonts w:ascii="Palatino Linotype" w:hAnsi="Palatino Linotype"/>
+                <w:lang w:val="en-US"/>
+              </w:rPr>
+              <w:t xml:space="preserve">/NIFU (by invitation) </w:t>
+            </w:r>
+          </w:p>
+        </w:tc>
+      </w:tr>
+      <w:tr>
+        <w:tc>
+          <w:tcPr>
+            <w:tcW w:w="851" w:type="dxa"/>
+          </w:tcPr>
+          <w:p>
+            <w:pPr>
+              <w:jc w:val="right"/>
+              <w:rPr>
+                <w:rFonts w:ascii="Palatino Linotype" w:hAnsi="Palatino Linotype"/>
+                <w:lang w:val="en-US"/>
+              </w:rPr>
+            </w:pPr>
+            <w:r>
+              <w:rPr>
+                <w:rFonts w:ascii="Palatino Linotype" w:hAnsi="Palatino Linotype"/>
+                <w:lang w:val="en-US"/>
+              </w:rPr>
+              <w:t>2024</w:t>
+            </w:r>
+          </w:p>
+        </w:tc>
+        <w:tc>
+          <w:tcPr>
+            <w:tcW w:w="8165" w:type="dxa"/>
+          </w:tcPr>
           <w:p>
             <w:pPr>
               <w:pStyle w:val="ListParagraph"/>
@@ -3218,14 +3213,28 @@
                 <w:rFonts w:ascii="Palatino Linotype" w:hAnsi="Palatino Linotype"/>
                 <w:lang w:val="en-US"/>
               </w:rPr>
-              <w:t>University of Oslo</w:t>
-            </w:r>
-            <w:r>
-              <w:rPr>
-                <w:rFonts w:ascii="Palatino Linotype" w:hAnsi="Palatino Linotype"/>
-                <w:lang w:val="en-US"/>
-              </w:rPr>
-              <w:t>, Department Seminar</w:t>
+              <w:t>Bank of Italy; Nontraditional Data, Machine Learning, and Natura</w:t>
+            </w:r>
+            <w:r>
+              <w:rPr>
+                <w:rFonts w:ascii="Palatino Linotype" w:hAnsi="Palatino Linotype"/>
+                <w:lang w:val="en-US"/>
+              </w:rPr>
+              <w:t>l</w:t>
+            </w:r>
+            <w:r>
+              <w:rPr>
+                <w:rFonts w:ascii="Palatino Linotype" w:hAnsi="Palatino Linotype"/>
+                <w:lang w:val="en-US"/>
+              </w:rPr>
+              <w:t xml:space="preserve"> </w:t>
+            </w:r>
+            <w:r>
+              <w:rPr>
+                <w:rFonts w:ascii="Palatino Linotype" w:hAnsi="Palatino Linotype"/>
+                <w:lang w:val="en-US"/>
+              </w:rPr>
+              <w:t>Language Processing for Macroeconomics</w:t>
             </w:r>
             <w:r>
               <w:rPr>
@@ -3252,44 +3261,9 @@
                 <w:rFonts w:ascii="Palatino Linotype" w:hAnsi="Palatino Linotype"/>
                 <w:lang w:val="en-US"/>
               </w:rPr>
-              <w:t>University of Oslo; Workshop; The Demand and Supply of Public Education</w:t>
-            </w:r>
-            <w:r>
-              <w:rPr>
-                <w:rFonts w:ascii="Palatino Linotype" w:hAnsi="Palatino Linotype"/>
-                <w:lang w:val="en-US"/>
-              </w:rPr>
-              <w:t xml:space="preserve"> (by invitation)</w:t>
-            </w:r>
-          </w:p>
-        </w:tc>
-      </w:tr>
-      <w:tr>
-        <w:tc>
-          <w:tcPr>
-            <w:tcW w:w="851" w:type="dxa"/>
-          </w:tcPr>
-          <w:p>
-            <w:pPr>
-              <w:jc w:val="right"/>
-              <w:rPr>
-                <w:rFonts w:ascii="Palatino Linotype" w:hAnsi="Palatino Linotype"/>
-                <w:lang w:val="en-US"/>
-              </w:rPr>
-            </w:pPr>
-            <w:r>
-              <w:rPr>
-                <w:rFonts w:ascii="Palatino Linotype" w:hAnsi="Palatino Linotype"/>
-                <w:lang w:val="en-US"/>
-              </w:rPr>
-              <w:t>2023</w:t>
-            </w:r>
-          </w:p>
-        </w:tc>
-        <w:tc>
-          <w:tcPr>
-            <w:tcW w:w="8165" w:type="dxa"/>
-          </w:tcPr>
+              <w:t>Norwegian School of Economics / FAIR (brown bag seminar)</w:t>
+            </w:r>
+          </w:p>
           <w:p>
             <w:pPr>
               <w:pStyle w:val="ListParagraph"/>
@@ -3302,51 +3276,28 @@
                 <w:lang w:val="en-US"/>
               </w:rPr>
             </w:pPr>
-            <w:proofErr w:type="spellStart"/>
-            <w:r>
-              <w:rPr>
-                <w:rFonts w:ascii="Palatino Linotype" w:hAnsi="Palatino Linotype"/>
-                <w:lang w:val="en-US"/>
-              </w:rPr>
-              <w:t>CESifo</w:t>
-            </w:r>
-            <w:proofErr w:type="spellEnd"/>
-            <w:r>
-              <w:rPr>
-                <w:rFonts w:ascii="Palatino Linotype" w:hAnsi="Palatino Linotype"/>
-                <w:lang w:val="en-US"/>
-              </w:rPr>
-              <w:t xml:space="preserve"> / Junior Workshop on the Economics of Education</w:t>
-            </w:r>
-          </w:p>
-        </w:tc>
-      </w:tr>
-      <w:tr>
-        <w:tc>
-          <w:tcPr>
-            <w:tcW w:w="851" w:type="dxa"/>
-          </w:tcPr>
-          <w:p>
-            <w:pPr>
-              <w:jc w:val="right"/>
-              <w:rPr>
-                <w:rFonts w:ascii="Palatino Linotype" w:hAnsi="Palatino Linotype"/>
-                <w:lang w:val="en-US"/>
-              </w:rPr>
-            </w:pPr>
-            <w:r>
-              <w:rPr>
-                <w:rFonts w:ascii="Palatino Linotype" w:hAnsi="Palatino Linotype"/>
-                <w:lang w:val="en-US"/>
-              </w:rPr>
-              <w:t>2023</w:t>
-            </w:r>
-          </w:p>
-        </w:tc>
-        <w:tc>
-          <w:tcPr>
-            <w:tcW w:w="8165" w:type="dxa"/>
-          </w:tcPr>
+            <w:r>
+              <w:rPr>
+                <w:rFonts w:ascii="Palatino Linotype" w:hAnsi="Palatino Linotype"/>
+                <w:lang w:val="en-US"/>
+              </w:rPr>
+              <w:t>University of Oslo</w:t>
+            </w:r>
+            <w:r>
+              <w:rPr>
+                <w:rFonts w:ascii="Palatino Linotype" w:hAnsi="Palatino Linotype"/>
+                <w:lang w:val="en-US"/>
+              </w:rPr>
+              <w:t>, Department Seminar</w:t>
+            </w:r>
+            <w:r>
+              <w:rPr>
+                <w:rFonts w:ascii="Palatino Linotype" w:hAnsi="Palatino Linotype"/>
+                <w:lang w:val="en-US"/>
+              </w:rPr>
+              <w:t xml:space="preserve"> </w:t>
+            </w:r>
+          </w:p>
           <w:p>
             <w:pPr>
               <w:pStyle w:val="ListParagraph"/>
@@ -3364,35 +3315,14 @@
                 <w:rFonts w:ascii="Palatino Linotype" w:hAnsi="Palatino Linotype"/>
                 <w:lang w:val="en-US"/>
               </w:rPr>
-              <w:t>University of Oslo</w:t>
-            </w:r>
-            <w:r>
-              <w:rPr>
-                <w:rFonts w:ascii="Palatino Linotype" w:hAnsi="Palatino Linotype"/>
-                <w:lang w:val="en-US"/>
-              </w:rPr>
-              <w:t>;</w:t>
-            </w:r>
-            <w:r>
-              <w:rPr>
-                <w:rFonts w:ascii="Palatino Linotype" w:hAnsi="Palatino Linotype"/>
-                <w:lang w:val="en-US"/>
-              </w:rPr>
-              <w:t xml:space="preserve"> PhD Workshop</w:t>
-            </w:r>
-            <w:r>
-              <w:rPr>
-                <w:rFonts w:ascii="Palatino Linotype" w:hAnsi="Palatino Linotype"/>
-                <w:lang w:val="en-US"/>
-              </w:rPr>
-              <w:t>;</w:t>
-            </w:r>
-            <w:r>
-              <w:rPr>
-                <w:rFonts w:ascii="Palatino Linotype" w:hAnsi="Palatino Linotype"/>
-                <w:lang w:val="en-US"/>
-              </w:rPr>
-              <w:t xml:space="preserve"> Oslo PhD Initiative in Economic</w:t>
+              <w:t>University of Oslo; Workshop; The Demand and Supply of Public Education</w:t>
+            </w:r>
+            <w:r>
+              <w:rPr>
+                <w:rFonts w:ascii="Palatino Linotype" w:hAnsi="Palatino Linotype"/>
+                <w:lang w:val="en-US"/>
+              </w:rPr>
+              <w:t xml:space="preserve"> (by invitation)</w:t>
             </w:r>
           </w:p>
         </w:tc>
@@ -3415,7 +3345,7 @@
                 <w:rFonts w:ascii="Palatino Linotype" w:hAnsi="Palatino Linotype"/>
                 <w:lang w:val="en-US"/>
               </w:rPr>
-              <w:t>2022</w:t>
+              <w:t>2023</w:t>
             </w:r>
           </w:p>
         </w:tc>
@@ -3435,19 +3365,21 @@
                 <w:lang w:val="en-US"/>
               </w:rPr>
             </w:pPr>
-            <w:r>
-              <w:rPr>
-                <w:rFonts w:ascii="Palatino Linotype" w:hAnsi="Palatino Linotype"/>
-                <w:lang w:val="en-US"/>
-              </w:rPr>
-              <w:t>University of Oslo; Workshop; The Demand and Supply of Public Education</w:t>
-            </w:r>
-            <w:r>
-              <w:rPr>
-                <w:rFonts w:ascii="Palatino Linotype" w:hAnsi="Palatino Linotype"/>
-                <w:lang w:val="en-US"/>
-              </w:rPr>
-              <w:t xml:space="preserve"> (by invitation)</w:t>
+            <w:proofErr w:type="spellStart"/>
+            <w:r>
+              <w:rPr>
+                <w:rFonts w:ascii="Palatino Linotype" w:hAnsi="Palatino Linotype"/>
+                <w:lang w:val="en-US"/>
+              </w:rPr>
+              <w:t>CESifo</w:t>
+            </w:r>
+            <w:proofErr w:type="spellEnd"/>
+            <w:r>
+              <w:rPr>
+                <w:rFonts w:ascii="Palatino Linotype" w:hAnsi="Palatino Linotype"/>
+                <w:lang w:val="en-US"/>
+              </w:rPr>
+              <w:t xml:space="preserve"> / Junior Workshop on the Economics of Education</w:t>
             </w:r>
           </w:p>
         </w:tc>
@@ -3470,14 +3402,7 @@
                 <w:rFonts w:ascii="Palatino Linotype" w:hAnsi="Palatino Linotype"/>
                 <w:lang w:val="en-US"/>
               </w:rPr>
-              <w:t>202</w:t>
-            </w:r>
-            <w:r>
-              <w:rPr>
-                <w:rFonts w:ascii="Palatino Linotype" w:hAnsi="Palatino Linotype"/>
-                <w:lang w:val="en-US"/>
-              </w:rPr>
-              <w:t>2</w:t>
+              <w:t>2023</w:t>
             </w:r>
           </w:p>
         </w:tc>
@@ -3502,7 +3427,35 @@
                 <w:rFonts w:ascii="Palatino Linotype" w:hAnsi="Palatino Linotype"/>
                 <w:lang w:val="en-US"/>
               </w:rPr>
-              <w:t>University of Oslo; PhD Workshop; Oslo PhD Initiative in Economic</w:t>
+              <w:t>University of Oslo</w:t>
+            </w:r>
+            <w:r>
+              <w:rPr>
+                <w:rFonts w:ascii="Palatino Linotype" w:hAnsi="Palatino Linotype"/>
+                <w:lang w:val="en-US"/>
+              </w:rPr>
+              <w:t>;</w:t>
+            </w:r>
+            <w:r>
+              <w:rPr>
+                <w:rFonts w:ascii="Palatino Linotype" w:hAnsi="Palatino Linotype"/>
+                <w:lang w:val="en-US"/>
+              </w:rPr>
+              <w:t xml:space="preserve"> PhD Workshop</w:t>
+            </w:r>
+            <w:r>
+              <w:rPr>
+                <w:rFonts w:ascii="Palatino Linotype" w:hAnsi="Palatino Linotype"/>
+                <w:lang w:val="en-US"/>
+              </w:rPr>
+              <w:t>;</w:t>
+            </w:r>
+            <w:r>
+              <w:rPr>
+                <w:rFonts w:ascii="Palatino Linotype" w:hAnsi="Palatino Linotype"/>
+                <w:lang w:val="en-US"/>
+              </w:rPr>
+              <w:t xml:space="preserve"> Oslo PhD Initiative in Economic</w:t>
             </w:r>
           </w:p>
         </w:tc>
@@ -3550,6 +3503,116 @@
                 <w:rFonts w:ascii="Palatino Linotype" w:hAnsi="Palatino Linotype"/>
                 <w:lang w:val="en-US"/>
               </w:rPr>
+              <w:t>University of Oslo; Workshop; The Demand and Supply of Public Education</w:t>
+            </w:r>
+            <w:r>
+              <w:rPr>
+                <w:rFonts w:ascii="Palatino Linotype" w:hAnsi="Palatino Linotype"/>
+                <w:lang w:val="en-US"/>
+              </w:rPr>
+              <w:t xml:space="preserve"> (by invitation)</w:t>
+            </w:r>
+          </w:p>
+        </w:tc>
+      </w:tr>
+      <w:tr>
+        <w:tc>
+          <w:tcPr>
+            <w:tcW w:w="851" w:type="dxa"/>
+          </w:tcPr>
+          <w:p>
+            <w:pPr>
+              <w:jc w:val="right"/>
+              <w:rPr>
+                <w:rFonts w:ascii="Palatino Linotype" w:hAnsi="Palatino Linotype"/>
+                <w:lang w:val="en-US"/>
+              </w:rPr>
+            </w:pPr>
+            <w:r>
+              <w:rPr>
+                <w:rFonts w:ascii="Palatino Linotype" w:hAnsi="Palatino Linotype"/>
+                <w:lang w:val="en-US"/>
+              </w:rPr>
+              <w:t>202</w:t>
+            </w:r>
+            <w:r>
+              <w:rPr>
+                <w:rFonts w:ascii="Palatino Linotype" w:hAnsi="Palatino Linotype"/>
+                <w:lang w:val="en-US"/>
+              </w:rPr>
+              <w:t>2</w:t>
+            </w:r>
+          </w:p>
+        </w:tc>
+        <w:tc>
+          <w:tcPr>
+            <w:tcW w:w="8165" w:type="dxa"/>
+          </w:tcPr>
+          <w:p>
+            <w:pPr>
+              <w:pStyle w:val="ListParagraph"/>
+              <w:numPr>
+                <w:ilvl w:val="0"/>
+                <w:numId w:val="2"/>
+              </w:numPr>
+              <w:rPr>
+                <w:rFonts w:ascii="Palatino Linotype" w:hAnsi="Palatino Linotype"/>
+                <w:lang w:val="en-US"/>
+              </w:rPr>
+            </w:pPr>
+            <w:r>
+              <w:rPr>
+                <w:rFonts w:ascii="Palatino Linotype" w:hAnsi="Palatino Linotype"/>
+                <w:lang w:val="en-US"/>
+              </w:rPr>
+              <w:t>University of Oslo; PhD Workshop; Oslo PhD Initiative in Economic</w:t>
+            </w:r>
+          </w:p>
+        </w:tc>
+      </w:tr>
+      <w:tr>
+        <w:tc>
+          <w:tcPr>
+            <w:tcW w:w="851" w:type="dxa"/>
+          </w:tcPr>
+          <w:p>
+            <w:pPr>
+              <w:jc w:val="right"/>
+              <w:rPr>
+                <w:rFonts w:ascii="Palatino Linotype" w:hAnsi="Palatino Linotype"/>
+                <w:lang w:val="en-US"/>
+              </w:rPr>
+            </w:pPr>
+            <w:r>
+              <w:rPr>
+                <w:rFonts w:ascii="Palatino Linotype" w:hAnsi="Palatino Linotype"/>
+                <w:lang w:val="en-US"/>
+              </w:rPr>
+              <w:t>2022</w:t>
+            </w:r>
+          </w:p>
+        </w:tc>
+        <w:tc>
+          <w:tcPr>
+            <w:tcW w:w="8165" w:type="dxa"/>
+          </w:tcPr>
+          <w:p>
+            <w:pPr>
+              <w:pStyle w:val="ListParagraph"/>
+              <w:numPr>
+                <w:ilvl w:val="0"/>
+                <w:numId w:val="2"/>
+              </w:numPr>
+              <w:rPr>
+                <w:rFonts w:ascii="Palatino Linotype" w:hAnsi="Palatino Linotype"/>
+                <w:lang w:val="en-US"/>
+              </w:rPr>
+            </w:pPr>
+            <w:r>
+              <w:rPr>
+                <w:rFonts w:ascii="Palatino Linotype" w:hAnsi="Palatino Linotype"/>
+                <w:lang w:val="en-US"/>
+              </w:rPr>
               <w:t>Lund University; PhD Workshop in the Economics of Education</w:t>
             </w:r>
           </w:p>
@@ -3619,6 +3682,25 @@
     </w:p>
     <w:p>
       <w:pPr>
+        <w:rPr>
+          <w:rFonts w:ascii="Palatino Linotype" w:hAnsi="Palatino Linotype"/>
+          <w:b/>
+          <w:bCs/>
+          <w:lang w:val="en-US"/>
+        </w:rPr>
+      </w:pPr>
+      <w:r>
+        <w:rPr>
+          <w:rFonts w:ascii="Palatino Linotype" w:hAnsi="Palatino Linotype"/>
+          <w:b/>
+          <w:bCs/>
+          <w:lang w:val="en-US"/>
+        </w:rPr>
+        <w:br w:type="page"/>
+      </w:r>
+    </w:p>
+    <w:p>
+      <w:pPr>
         <w:pBdr>
           <w:bottom w:val="single" w:sz="4" w:space="1" w:color="auto"/>
         </w:pBdr>
@@ -3636,6 +3718,7 @@
           <w:bCs/>
           <w:lang w:val="en-US"/>
         </w:rPr>
+        <w:lastRenderedPageBreak/>
         <w:t>Other</w:t>
       </w:r>
       <w:r>
@@ -3835,7 +3918,6 @@
           <w:bCs/>
           <w:lang w:val="en-US"/>
         </w:rPr>
-        <w:lastRenderedPageBreak/>
         <w:t>Software Packages</w:t>
       </w:r>
     </w:p>
@@ -4957,6 +5039,7 @@
   <w:style w:type="character" w:default="1" w:styleId="DefaultParagraphFont">
     <w:name w:val="Default Paragraph Font"/>
     <w:uiPriority w:val="1"/>
+    <w:semiHidden/>
     <w:unhideWhenUsed/>
   </w:style>
   <w:style w:type="table" w:default="1" w:styleId="TableNormal">

</xml_diff>